<commit_message>
Consolida funcionalidades Local y mejoras operativas
</commit_message>
<xml_diff>
--- a/docs/manuales_solucion/word/01_produccion.docx
+++ b/docs/manuales_solucion/word/01_produccion.docx
@@ -23,7 +23,7 @@
         <w:pStyle w:val="ListBullet"/>
       </w:pPr>
       <w:r>
-        <w:t>Alcance por ambiente: Local; no promovido a QA</w:t>
+        <w:t>Alcance por ambiente: Local y QA</w:t>
       </w:r>
     </w:p>
     <w:p>
@@ -31,7 +31,7 @@
         <w:pStyle w:val="ListBullet"/>
       </w:pPr>
       <w:r>
-        <w:t>Ultima revision: 2026-08-21</w:t>
+        <w:t>Ultima revision: 2026-08-25</w:t>
       </w:r>
     </w:p>
     <w:p>
@@ -39,7 +39,7 @@
         <w:pStyle w:val="ListBullet"/>
       </w:pPr>
       <w:r>
-        <w:t>Capacidades cubiertas: productos/servicios, recetas, fases ponderadas, ordenes y entregables por area</w:t>
+        <w:t>Capacidades cubiertas: productos/servicios, recetas, fases ponderadas, planeacion multi-dia, ordenes y entregables por area</w:t>
       </w:r>
     </w:p>
     <w:p>
@@ -113,12 +113,17 @@
     </w:p>
     <w:p>
       <w:r>
+        <w:t>En Local, liberar, iniciar, pausar, reanudar, enviar a validacion, finalizar y cancelar requieren permisos independientes. Terminar una etapa exige `production.order_stage.complete`; capturar avance con `production.order_stage.update` no concede esa declaracion. La alta actual valida, reserva y nace liberada, por lo que requiere `production.order.release`.</w:t>
+      </w:r>
+    </w:p>
+    <w:p>
+      <w:r>
         <w:t>Se requieren permisos `production.recipe.*`, `production.order.*` o `production.order_stage.update`, segun la tarea. La asignacion automatica de folio usa el permiso de alta; editar su configuracion pertenece a Administracion.</w:t>
       </w:r>
     </w:p>
     <w:p>
       <w:r>
-        <w:t>El producto debe estar activo. Una receta productiva requiere materiales elegibles de Almacenes, puestos y areas productivas de RH y, cuando aplique, maquinaria activa. Una orden requiere una version aprobada vigente.</w:t>
+        <w:t>El producto debe estar activo. Una receta productiva requiere materiales elegibles de Almacenes con una unidad activa del catalogo de Administracion, puestos y areas productivas de RH y, cuando aplique, maquinaria existente que no este inactiva. Una maquina en mantenimiento puede formar parte de la receta, pero bloqueara la orden mientras no vuelva a estar activa. El area RH de la maquina es recomendable para asignacion y reportes, no un requisito para definir el proceso. Una orden requiere una version aprobada vigente.</w:t>
       </w:r>
     </w:p>
     <w:p>
@@ -186,6 +191,11 @@
       </w:r>
     </w:p>
     <w:p>
+      <w:r>
+        <w:t>Un articulo cuya unidad base no exista o este inactiva se muestra como no disponible y no puede agregarse. Corrija el articulo en Almacenes. Los alias heredados administrados `LTS -&gt; LTR` y `MT -&gt; MTR` se normalizan de forma auditada. Si se trata de cualquier otra unidad y ya existen movimientos o reservas, la historia permanece protegida: cree un articulo sustituto con la unidad activa y regularice existencias mediante el procedimiento autorizado.</w:t>
+      </w:r>
+    </w:p>
+    <w:p>
       <w:pPr>
         <w:pStyle w:val="Heading2"/>
       </w:pPr>
@@ -195,7 +205,12 @@
     </w:p>
     <w:p>
       <w:r>
-        <w:t>Seleccione receta aprobada, cantidad, fecha, prioridad y responsables. La orden copia recursos, costos, areas, numero y peso de cada fase; cambios posteriores en la receta no la alteran.</w:t>
+        <w:t>Seleccione receta aprobada, cantidad, inicio planeado, dias productivos, fecha requerida, prioridad y responsables. La receta propone una duracion que puede ajustar en la orden. Antes de asignar el folio, el sistema valida materiales una sola vez y distribuye los minutos de capacidad laboral y maquinaria de lunes a viernes; muestra el horizonte, el minimo calculado y el desglose por fecha. Si falta un recurso, muestra su nombre, cantidad requerida, disponible y unidad. La fecha requerida no puede quedar antes del fin planeado. La orden copia recursos, costos, areas, numero y peso de cada fase; cambios posteriores en la receta no la alteran.</w:t>
+      </w:r>
+    </w:p>
+    <w:p>
+      <w:r>
+        <w:t>En el editor de Recetas, **Validar definicion** solo confirma que materiales, puestos y maquinas existan y sean elegibles, y proyecta cantidades y costo. No revisa inventario ni disponibilidad de horas. Es normal que una receta sea valida aunque una orden concreta no pueda liberarse por faltantes o mantenimiento; esa disponibilidad se comprueba al generar la orden usando sus dias planeados.</w:t>
       </w:r>
     </w:p>
     <w:p>
@@ -233,12 +248,12 @@
     </w:p>
     <w:p>
       <w:r>
-        <w:t>| En espera de recursos | Tiene un faltante o confirmacion pendiente. |</w:t>
+        <w:t>| En espera de recursos | Tiene un faltante o confirmacion pendiente. Puede iniciar solo si conserva las reservas materiales requeridas. |</w:t>
       </w:r>
     </w:p>
     <w:p>
       <w:r>
-        <w:t>| En produccion | Al menos una fase esta en ejecucion. |</w:t>
+        <w:t>| En produccion | Al entrar por primera vez, Almacenes consume las reservas y registra las salidas de materiales en sus almacenes de origen. |</w:t>
       </w:r>
     </w:p>
     <w:p>
@@ -253,12 +268,70 @@
     </w:p>
     <w:p>
       <w:r>
-        <w:t>| Terminada | Cierre operativo; no vuelve a una fase anterior. |</w:t>
+        <w:t>| Terminada | Cierre operativo; exige fases concluidas y consolida costos sin volver a registrar salidas. |</w:t>
       </w:r>
     </w:p>
     <w:p>
       <w:r>
-        <w:t>| Cancelada | No continuara; se liberan reservas aplicables. |</w:t>
+        <w:t>| Cancelada | No continuara. Antes de iniciar libera reservas; despues de iniciar conserva las salidas fisicas ya registradas. |</w:t>
+      </w:r>
+    </w:p>
+    <w:p>
+      <w:pPr>
+        <w:pStyle w:val="Heading2"/>
+      </w:pPr>
+      <w:r>
+        <w:t>Como terminar una orden</w:t>
+      </w:r>
+    </w:p>
+    <w:p>
+      <w:pPr>
+        <w:pStyle w:val="ListNumber"/>
+      </w:pPr>
+      <w:r>
+        <w:t>Mantenga la orden en **En produccion**.</w:t>
+      </w:r>
+    </w:p>
+    <w:p>
+      <w:pPr>
+        <w:pStyle w:val="ListNumber"/>
+      </w:pPr>
+      <w:r>
+        <w:t>Pulse la tarjeta de una fase y capture el porcentaje realmente completado.</w:t>
+      </w:r>
+    </w:p>
+    <w:p>
+      <w:pPr>
+        <w:pStyle w:val="ListNumber"/>
+      </w:pPr>
+      <w:r>
+        <w:t>Use de 1% a 99% mientras siga **En proceso**; capture 100% cuando la fase este **Terminada**.</w:t>
+      </w:r>
+    </w:p>
+    <w:p>
+      <w:pPr>
+        <w:pStyle w:val="ListNumber"/>
+      </w:pPr>
+      <w:r>
+        <w:t>Repita hasta que todas las fases tengan 100%. La orden pasa automaticamente a **En validacion**.</w:t>
+      </w:r>
+    </w:p>
+    <w:p>
+      <w:pPr>
+        <w:pStyle w:val="ListNumber"/>
+      </w:pPr>
+      <w:r>
+        <w:t>Seleccione **Terminada**. El cierre conserva el costo de materiales y no vuelve a descontarlos.</w:t>
+      </w:r>
+    </w:p>
+    <w:p>
+      <w:r>
+        <w:t>El selector solo muestra cambios validos para el estado actual. Si una orden heredada llego a **En validacion** con fases pendientes, vuelva a **En produccion** y lleve cada tarjeta a 100%; no registre otra salida manual en Almacenes.</w:t>
+      </w:r>
+    </w:p>
+    <w:p>
+      <w:r>
+        <w:t>Los minutos reales y la eficiencia de mano de obra/maquinaria no son obligatorios en este corte. Se incorporaran despues, cuando exista una base operativa suficiente para auditarlos sin inventar precision.</w:t>
       </w:r>
     </w:p>
     <w:p>
@@ -295,6 +368,46 @@
     </w:p>
     <w:p>
       <w:pPr>
+        <w:pStyle w:val="ListBullet"/>
+      </w:pPr>
+      <w:r>
+        <w:t>**Todas las fases deben tener 100%:** vuelva a **En produccion**, abra cada tarjeta y capture el porcentaje faltante.</w:t>
+      </w:r>
+    </w:p>
+    <w:p>
+      <w:pPr>
+        <w:pStyle w:val="ListBullet"/>
+      </w:pPr>
+      <w:r>
+        <w:t>**Maquinaria sin area de RH vinculada:** abra **Produccion &gt; Maquinaria**, edite el equipo, seleccione un area activa de Recursos Humanos y actualice. Despues vuelva a abrir la receta; el sistema no vincula por coincidencia de nombre.</w:t>
+      </w:r>
+    </w:p>
+    <w:p>
+      <w:pPr>
+        <w:pStyle w:val="ListBullet"/>
+      </w:pPr>
+      <w:r>
+        <w:t>**Unidad de medida no activa:** el material usa un codigo que no pertenece al catalogo activo; corriga o sustituya el articulo de Almacenes.</w:t>
+      </w:r>
+    </w:p>
+    <w:p>
+      <w:pPr>
+        <w:pStyle w:val="ListBullet"/>
+      </w:pPr>
+      <w:r>
+        <w:t>**Capacidad laboral insuficiente:** asigne trabajadores activos al puesto requerido por la receta. El responsable general o de fase no reemplaza una necesidad de mano de obra distinta.</w:t>
+      </w:r>
+    </w:p>
+    <w:p>
+      <w:pPr>
+        <w:pStyle w:val="ListBullet"/>
+      </w:pPr>
+      <w:r>
+        <w:t>**Los dias productivos no alcanzan:** aumente el horizonte o libere capacidad ya comprometida. El calendario actual considera lunes a viernes; turnos, festivos, ausencias y mantenimiento configurable se incorporaran en una evolucion posterior.</w:t>
+      </w:r>
+    </w:p>
+    <w:p>
+      <w:pPr>
         <w:pStyle w:val="Heading2"/>
       </w:pPr>
       <w:r>
@@ -303,7 +416,17 @@
     </w:p>
     <w:p>
       <w:r>
-        <w:t>Almacenes es autoridad de existencias y costo; RH de areas, puestos y trabajadores; Administracion de unidades y folios. Produccion conserva snapshots y no escribe schemas ajenos. La recepcion automatica completa de producto terminado y merma permanece pendiente.</w:t>
+        <w:t>Almacenes es autoridad de existencias y costo; RH de areas, puestos y trabajadores; Administracion de unidades y folios. Produccion conserva snapshots y no escribe schemas ajenos.</w:t>
+      </w:r>
+    </w:p>
+    <w:p>
+      <w:r>
+        <w:t>La reserva y la salida son hechos distintos: liberar la orden aparta material y reduce la disponibilidad, pero no la existencia fisica. La primera entrada a **En produccion** confirma el inicio operativo: Produccion solicita consumir cada reserva y Almacenes crea una salida inmutable en el almacen que la otorgo. Si una orden pausada se reanuda o vuelve desde validacion, no se genera otra salida. El cierre tampoco vuelve a descontar; consolida materiales ya consumidos. Cancelar antes de iniciar libera lo apartado, mientras que cancelar despues conserva el Kardex real. No registre salidas manuales duplicadas.</w:t>
+      </w:r>
+    </w:p>
+    <w:p>
+      <w:r>
+        <w:t>Cuando la orden llega a **Terminada**, queda disponible en **Almacenes &gt; Movimientos &gt; Entradas de produccion terminada**. El almacenista valida la recepcion fisica total o parcial; Almacenes registra la entrada contra el articulo terminado vinculado. Su permiso solo obtiene una proyeccion de recepcion con folio, producto, cantidad, unidad y costo unitario: no expone receta, recursos, responsables ni costos totales de Produccion. Produccion no escribe existencias ni da por recibido automaticamente lo que aun no fue contado. La recepcion de merma permanece pendiente.</w:t>
       </w:r>
     </w:p>
     <w:p>

</xml_diff>